<commit_message>
Add group project pages with charts, update navbar, ignore CSV files
</commit_message>
<xml_diff>
--- a/docs/project/final_report.docx
+++ b/docs/project/final_report.docx
@@ -38206,7 +38206,7 @@
     </w:p>
     <w:bookmarkEnd w:id="60"/>
     <w:bookmarkEnd w:id="61"/>
-    <w:bookmarkStart w:id="72" w:name="skill-gap-analysis"/>
+    <w:bookmarkStart w:id="78" w:name="skill-gap-analysis"/>
     <w:p>
       <w:pPr>
         <w:pStyle w:val="Heading1"/>
@@ -39415,8 +39415,848 @@
         <w:t xml:space="preserve">df_skills</w:t>
       </w:r>
     </w:p>
+    <w:tbl>
+      <w:tblPr>
+        <w:tblStyle w:val="Table"/>
+        <w:tblW w:type="auto" w:w="0"/>
+        <w:tblLook w:firstRow="1" w:lastRow="0" w:firstColumn="0" w:lastColumn="0" w:noHBand="0" w:noVBand="0" w:val="0020"/>
+        <w:jc w:val="start"/>
+      </w:tblPr>
+      <w:tblGrid>
+        <w:gridCol w:w="792"/>
+        <w:gridCol w:w="792"/>
+        <w:gridCol w:w="792"/>
+        <w:gridCol w:w="792"/>
+        <w:gridCol w:w="792"/>
+        <w:gridCol w:w="792"/>
+        <w:gridCol w:w="792"/>
+        <w:gridCol w:w="792"/>
+        <w:gridCol w:w="792"/>
+        <w:gridCol w:w="792"/>
+      </w:tblGrid>
+      <w:tr>
+        <w:trPr>
+          <w:tblHeader w:val="true"/>
+        </w:trPr>
+        <w:tc>
+          <w:tcPr/>
+          <w:p>
+            <w:pPr>
+              <w:pStyle w:val="Compact"/>
+            </w:pPr>
+          </w:p>
+        </w:tc>
+        <w:tc>
+          <w:tcPr/>
+          <w:p>
+            <w:pPr>
+              <w:pStyle w:val="Compact"/>
+              <w:jc w:val="left"/>
+            </w:pPr>
+            <w:r>
+              <w:t xml:space="preserve">Python</w:t>
+            </w:r>
+          </w:p>
+        </w:tc>
+        <w:tc>
+          <w:tcPr/>
+          <w:p>
+            <w:pPr>
+              <w:pStyle w:val="Compact"/>
+              <w:jc w:val="left"/>
+            </w:pPr>
+            <w:r>
+              <w:t xml:space="preserve">SQL</w:t>
+            </w:r>
+          </w:p>
+        </w:tc>
+        <w:tc>
+          <w:tcPr/>
+          <w:p>
+            <w:pPr>
+              <w:pStyle w:val="Compact"/>
+              <w:jc w:val="left"/>
+            </w:pPr>
+            <w:r>
+              <w:t xml:space="preserve">Statistics</w:t>
+            </w:r>
+          </w:p>
+        </w:tc>
+        <w:tc>
+          <w:tcPr/>
+          <w:p>
+            <w:pPr>
+              <w:pStyle w:val="Compact"/>
+              <w:jc w:val="left"/>
+            </w:pPr>
+            <w:r>
+              <w:t xml:space="preserve">Data Visualization</w:t>
+            </w:r>
+          </w:p>
+        </w:tc>
+        <w:tc>
+          <w:tcPr/>
+          <w:p>
+            <w:pPr>
+              <w:pStyle w:val="Compact"/>
+              <w:jc w:val="left"/>
+            </w:pPr>
+            <w:r>
+              <w:t xml:space="preserve">Excel</w:t>
+            </w:r>
+          </w:p>
+        </w:tc>
+        <w:tc>
+          <w:tcPr/>
+          <w:p>
+            <w:pPr>
+              <w:pStyle w:val="Compact"/>
+              <w:jc w:val="left"/>
+            </w:pPr>
+            <w:r>
+              <w:t xml:space="preserve">Tableau/Power BI</w:t>
+            </w:r>
+          </w:p>
+        </w:tc>
+        <w:tc>
+          <w:tcPr/>
+          <w:p>
+            <w:pPr>
+              <w:pStyle w:val="Compact"/>
+              <w:jc w:val="left"/>
+            </w:pPr>
+            <w:r>
+              <w:t xml:space="preserve">AWS/Azure</w:t>
+            </w:r>
+          </w:p>
+        </w:tc>
+        <w:tc>
+          <w:tcPr/>
+          <w:p>
+            <w:pPr>
+              <w:pStyle w:val="Compact"/>
+              <w:jc w:val="left"/>
+            </w:pPr>
+            <w:r>
+              <w:t xml:space="preserve">Machine Learning</w:t>
+            </w:r>
+          </w:p>
+        </w:tc>
+        <w:tc>
+          <w:tcPr/>
+          <w:p>
+            <w:pPr>
+              <w:pStyle w:val="Compact"/>
+              <w:jc w:val="left"/>
+            </w:pPr>
+            <w:r>
+              <w:t xml:space="preserve">AI/ML Tools</w:t>
+            </w:r>
+          </w:p>
+        </w:tc>
+      </w:tr>
+      <w:tr>
+        <w:trPr>
+          <w:tblHeader w:val="true"/>
+        </w:trPr>
+        <w:tc>
+          <w:tcPr/>
+          <w:p>
+            <w:pPr>
+              <w:pStyle w:val="Compact"/>
+              <w:jc w:val="left"/>
+            </w:pPr>
+            <w:r>
+              <w:t xml:space="preserve">Name</w:t>
+            </w:r>
+          </w:p>
+        </w:tc>
+        <w:tc>
+          <w:tcPr/>
+          <w:p>
+            <w:pPr>
+              <w:pStyle w:val="Compact"/>
+            </w:pPr>
+          </w:p>
+        </w:tc>
+        <w:tc>
+          <w:tcPr/>
+          <w:p>
+            <w:pPr>
+              <w:pStyle w:val="Compact"/>
+            </w:pPr>
+          </w:p>
+        </w:tc>
+        <w:tc>
+          <w:tcPr/>
+          <w:p>
+            <w:pPr>
+              <w:pStyle w:val="Compact"/>
+            </w:pPr>
+          </w:p>
+        </w:tc>
+        <w:tc>
+          <w:tcPr/>
+          <w:p>
+            <w:pPr>
+              <w:pStyle w:val="Compact"/>
+            </w:pPr>
+          </w:p>
+        </w:tc>
+        <w:tc>
+          <w:tcPr/>
+          <w:p>
+            <w:pPr>
+              <w:pStyle w:val="Compact"/>
+            </w:pPr>
+          </w:p>
+        </w:tc>
+        <w:tc>
+          <w:tcPr/>
+          <w:p>
+            <w:pPr>
+              <w:pStyle w:val="Compact"/>
+            </w:pPr>
+          </w:p>
+        </w:tc>
+        <w:tc>
+          <w:tcPr/>
+          <w:p>
+            <w:pPr>
+              <w:pStyle w:val="Compact"/>
+            </w:pPr>
+          </w:p>
+        </w:tc>
+        <w:tc>
+          <w:tcPr/>
+          <w:p>
+            <w:pPr>
+              <w:pStyle w:val="Compact"/>
+            </w:pPr>
+          </w:p>
+        </w:tc>
+        <w:tc>
+          <w:tcPr/>
+          <w:p>
+            <w:pPr>
+              <w:pStyle w:val="Compact"/>
+            </w:pPr>
+          </w:p>
+        </w:tc>
+      </w:tr>
+      <w:tr>
+        <w:tc>
+          <w:tcPr/>
+          <w:p>
+            <w:pPr>
+              <w:pStyle w:val="Compact"/>
+              <w:jc w:val="left"/>
+            </w:pPr>
+            <w:r>
+              <w:t xml:space="preserve">Zifan Chen</w:t>
+            </w:r>
+          </w:p>
+        </w:tc>
+        <w:tc>
+          <w:tcPr/>
+          <w:p>
+            <w:pPr>
+              <w:pStyle w:val="Compact"/>
+              <w:jc w:val="left"/>
+            </w:pPr>
+            <w:r>
+              <w:t xml:space="preserve">3</w:t>
+            </w:r>
+          </w:p>
+        </w:tc>
+        <w:tc>
+          <w:tcPr/>
+          <w:p>
+            <w:pPr>
+              <w:pStyle w:val="Compact"/>
+              <w:jc w:val="left"/>
+            </w:pPr>
+            <w:r>
+              <w:t xml:space="preserve">3</w:t>
+            </w:r>
+          </w:p>
+        </w:tc>
+        <w:tc>
+          <w:tcPr/>
+          <w:p>
+            <w:pPr>
+              <w:pStyle w:val="Compact"/>
+              <w:jc w:val="left"/>
+            </w:pPr>
+            <w:r>
+              <w:t xml:space="preserve">4</w:t>
+            </w:r>
+          </w:p>
+        </w:tc>
+        <w:tc>
+          <w:tcPr/>
+          <w:p>
+            <w:pPr>
+              <w:pStyle w:val="Compact"/>
+              <w:jc w:val="left"/>
+            </w:pPr>
+            <w:r>
+              <w:t xml:space="preserve">5</w:t>
+            </w:r>
+          </w:p>
+        </w:tc>
+        <w:tc>
+          <w:tcPr/>
+          <w:p>
+            <w:pPr>
+              <w:pStyle w:val="Compact"/>
+              <w:jc w:val="left"/>
+            </w:pPr>
+            <w:r>
+              <w:t xml:space="preserve">4</w:t>
+            </w:r>
+          </w:p>
+        </w:tc>
+        <w:tc>
+          <w:tcPr/>
+          <w:p>
+            <w:pPr>
+              <w:pStyle w:val="Compact"/>
+              <w:jc w:val="left"/>
+            </w:pPr>
+            <w:r>
+              <w:t xml:space="preserve">5</w:t>
+            </w:r>
+          </w:p>
+        </w:tc>
+        <w:tc>
+          <w:tcPr/>
+          <w:p>
+            <w:pPr>
+              <w:pStyle w:val="Compact"/>
+              <w:jc w:val="left"/>
+            </w:pPr>
+            <w:r>
+              <w:t xml:space="preserve">3</w:t>
+            </w:r>
+          </w:p>
+        </w:tc>
+        <w:tc>
+          <w:tcPr/>
+          <w:p>
+            <w:pPr>
+              <w:pStyle w:val="Compact"/>
+              <w:jc w:val="left"/>
+            </w:pPr>
+            <w:r>
+              <w:t xml:space="preserve">3</w:t>
+            </w:r>
+          </w:p>
+        </w:tc>
+        <w:tc>
+          <w:tcPr/>
+          <w:p>
+            <w:pPr>
+              <w:pStyle w:val="Compact"/>
+              <w:jc w:val="left"/>
+            </w:pPr>
+            <w:r>
+              <w:t xml:space="preserve">4</w:t>
+            </w:r>
+          </w:p>
+        </w:tc>
+      </w:tr>
+      <w:tr>
+        <w:tc>
+          <w:tcPr/>
+          <w:p>
+            <w:pPr>
+              <w:pStyle w:val="Compact"/>
+              <w:jc w:val="left"/>
+            </w:pPr>
+            <w:r>
+              <w:t xml:space="preserve">Jingyuan Yang</w:t>
+            </w:r>
+          </w:p>
+        </w:tc>
+        <w:tc>
+          <w:tcPr/>
+          <w:p>
+            <w:pPr>
+              <w:pStyle w:val="Compact"/>
+              <w:jc w:val="left"/>
+            </w:pPr>
+            <w:r>
+              <w:t xml:space="preserve">3</w:t>
+            </w:r>
+          </w:p>
+        </w:tc>
+        <w:tc>
+          <w:tcPr/>
+          <w:p>
+            <w:pPr>
+              <w:pStyle w:val="Compact"/>
+              <w:jc w:val="left"/>
+            </w:pPr>
+            <w:r>
+              <w:t xml:space="preserve">5</w:t>
+            </w:r>
+          </w:p>
+        </w:tc>
+        <w:tc>
+          <w:tcPr/>
+          <w:p>
+            <w:pPr>
+              <w:pStyle w:val="Compact"/>
+              <w:jc w:val="left"/>
+            </w:pPr>
+            <w:r>
+              <w:t xml:space="preserve">4</w:t>
+            </w:r>
+          </w:p>
+        </w:tc>
+        <w:tc>
+          <w:tcPr/>
+          <w:p>
+            <w:pPr>
+              <w:pStyle w:val="Compact"/>
+              <w:jc w:val="left"/>
+            </w:pPr>
+            <w:r>
+              <w:t xml:space="preserve">5</w:t>
+            </w:r>
+          </w:p>
+        </w:tc>
+        <w:tc>
+          <w:tcPr/>
+          <w:p>
+            <w:pPr>
+              <w:pStyle w:val="Compact"/>
+              <w:jc w:val="left"/>
+            </w:pPr>
+            <w:r>
+              <w:t xml:space="preserve">5</w:t>
+            </w:r>
+          </w:p>
+        </w:tc>
+        <w:tc>
+          <w:tcPr/>
+          <w:p>
+            <w:pPr>
+              <w:pStyle w:val="Compact"/>
+              <w:jc w:val="left"/>
+            </w:pPr>
+            <w:r>
+              <w:t xml:space="preserve">4</w:t>
+            </w:r>
+          </w:p>
+        </w:tc>
+        <w:tc>
+          <w:tcPr/>
+          <w:p>
+            <w:pPr>
+              <w:pStyle w:val="Compact"/>
+              <w:jc w:val="left"/>
+            </w:pPr>
+            <w:r>
+              <w:t xml:space="preserve">3</w:t>
+            </w:r>
+          </w:p>
+        </w:tc>
+        <w:tc>
+          <w:tcPr/>
+          <w:p>
+            <w:pPr>
+              <w:pStyle w:val="Compact"/>
+              <w:jc w:val="left"/>
+            </w:pPr>
+            <w:r>
+              <w:t xml:space="preserve">3</w:t>
+            </w:r>
+          </w:p>
+        </w:tc>
+        <w:tc>
+          <w:tcPr/>
+          <w:p>
+            <w:pPr>
+              <w:pStyle w:val="Compact"/>
+              <w:jc w:val="left"/>
+            </w:pPr>
+            <w:r>
+              <w:t xml:space="preserve">4</w:t>
+            </w:r>
+          </w:p>
+        </w:tc>
+      </w:tr>
+      <w:tr>
+        <w:tc>
+          <w:tcPr/>
+          <w:p>
+            <w:pPr>
+              <w:pStyle w:val="Compact"/>
+              <w:jc w:val="left"/>
+            </w:pPr>
+            <w:r>
+              <w:t xml:space="preserve">Zhenjie Shao</w:t>
+            </w:r>
+          </w:p>
+        </w:tc>
+        <w:tc>
+          <w:tcPr/>
+          <w:p>
+            <w:pPr>
+              <w:pStyle w:val="Compact"/>
+              <w:jc w:val="left"/>
+            </w:pPr>
+            <w:r>
+              <w:t xml:space="preserve">4</w:t>
+            </w:r>
+          </w:p>
+        </w:tc>
+        <w:tc>
+          <w:tcPr/>
+          <w:p>
+            <w:pPr>
+              <w:pStyle w:val="Compact"/>
+              <w:jc w:val="left"/>
+            </w:pPr>
+            <w:r>
+              <w:t xml:space="preserve">3</w:t>
+            </w:r>
+          </w:p>
+        </w:tc>
+        <w:tc>
+          <w:tcPr/>
+          <w:p>
+            <w:pPr>
+              <w:pStyle w:val="Compact"/>
+              <w:jc w:val="left"/>
+            </w:pPr>
+            <w:r>
+              <w:t xml:space="preserve">4</w:t>
+            </w:r>
+          </w:p>
+        </w:tc>
+        <w:tc>
+          <w:tcPr/>
+          <w:p>
+            <w:pPr>
+              <w:pStyle w:val="Compact"/>
+              <w:jc w:val="left"/>
+            </w:pPr>
+            <w:r>
+              <w:t xml:space="preserve">4</w:t>
+            </w:r>
+          </w:p>
+        </w:tc>
+        <w:tc>
+          <w:tcPr/>
+          <w:p>
+            <w:pPr>
+              <w:pStyle w:val="Compact"/>
+              <w:jc w:val="left"/>
+            </w:pPr>
+            <w:r>
+              <w:t xml:space="preserve">4</w:t>
+            </w:r>
+          </w:p>
+        </w:tc>
+        <w:tc>
+          <w:tcPr/>
+          <w:p>
+            <w:pPr>
+              <w:pStyle w:val="Compact"/>
+              <w:jc w:val="left"/>
+            </w:pPr>
+            <w:r>
+              <w:t xml:space="preserve">3</w:t>
+            </w:r>
+          </w:p>
+        </w:tc>
+        <w:tc>
+          <w:tcPr/>
+          <w:p>
+            <w:pPr>
+              <w:pStyle w:val="Compact"/>
+              <w:jc w:val="left"/>
+            </w:pPr>
+            <w:r>
+              <w:t xml:space="preserve">3</w:t>
+            </w:r>
+          </w:p>
+        </w:tc>
+        <w:tc>
+          <w:tcPr/>
+          <w:p>
+            <w:pPr>
+              <w:pStyle w:val="Compact"/>
+              <w:jc w:val="left"/>
+            </w:pPr>
+            <w:r>
+              <w:t xml:space="preserve">4</w:t>
+            </w:r>
+          </w:p>
+        </w:tc>
+        <w:tc>
+          <w:tcPr/>
+          <w:p>
+            <w:pPr>
+              <w:pStyle w:val="Compact"/>
+              <w:jc w:val="left"/>
+            </w:pPr>
+            <w:r>
+              <w:t xml:space="preserve">4</w:t>
+            </w:r>
+          </w:p>
+        </w:tc>
+      </w:tr>
+      <w:tr>
+        <w:tc>
+          <w:tcPr/>
+          <w:p>
+            <w:pPr>
+              <w:pStyle w:val="Compact"/>
+              <w:jc w:val="left"/>
+            </w:pPr>
+            <w:r>
+              <w:t xml:space="preserve">Zhuolun Wu</w:t>
+            </w:r>
+          </w:p>
+        </w:tc>
+        <w:tc>
+          <w:tcPr/>
+          <w:p>
+            <w:pPr>
+              <w:pStyle w:val="Compact"/>
+              <w:jc w:val="left"/>
+            </w:pPr>
+            <w:r>
+              <w:t xml:space="preserve">4</w:t>
+            </w:r>
+          </w:p>
+        </w:tc>
+        <w:tc>
+          <w:tcPr/>
+          <w:p>
+            <w:pPr>
+              <w:pStyle w:val="Compact"/>
+              <w:jc w:val="left"/>
+            </w:pPr>
+            <w:r>
+              <w:t xml:space="preserve">3</w:t>
+            </w:r>
+          </w:p>
+        </w:tc>
+        <w:tc>
+          <w:tcPr/>
+          <w:p>
+            <w:pPr>
+              <w:pStyle w:val="Compact"/>
+              <w:jc w:val="left"/>
+            </w:pPr>
+            <w:r>
+              <w:t xml:space="preserve">4</w:t>
+            </w:r>
+          </w:p>
+        </w:tc>
+        <w:tc>
+          <w:tcPr/>
+          <w:p>
+            <w:pPr>
+              <w:pStyle w:val="Compact"/>
+              <w:jc w:val="left"/>
+            </w:pPr>
+            <w:r>
+              <w:t xml:space="preserve">4</w:t>
+            </w:r>
+          </w:p>
+        </w:tc>
+        <w:tc>
+          <w:tcPr/>
+          <w:p>
+            <w:pPr>
+              <w:pStyle w:val="Compact"/>
+              <w:jc w:val="left"/>
+            </w:pPr>
+            <w:r>
+              <w:t xml:space="preserve">4</w:t>
+            </w:r>
+          </w:p>
+        </w:tc>
+        <w:tc>
+          <w:tcPr/>
+          <w:p>
+            <w:pPr>
+              <w:pStyle w:val="Compact"/>
+              <w:jc w:val="left"/>
+            </w:pPr>
+            <w:r>
+              <w:t xml:space="preserve">4</w:t>
+            </w:r>
+          </w:p>
+        </w:tc>
+        <w:tc>
+          <w:tcPr/>
+          <w:p>
+            <w:pPr>
+              <w:pStyle w:val="Compact"/>
+              <w:jc w:val="left"/>
+            </w:pPr>
+            <w:r>
+              <w:t xml:space="preserve">3</w:t>
+            </w:r>
+          </w:p>
+        </w:tc>
+        <w:tc>
+          <w:tcPr/>
+          <w:p>
+            <w:pPr>
+              <w:pStyle w:val="Compact"/>
+              <w:jc w:val="left"/>
+            </w:pPr>
+            <w:r>
+              <w:t xml:space="preserve">3</w:t>
+            </w:r>
+          </w:p>
+        </w:tc>
+        <w:tc>
+          <w:tcPr/>
+          <w:p>
+            <w:pPr>
+              <w:pStyle w:val="Compact"/>
+              <w:jc w:val="left"/>
+            </w:pPr>
+            <w:r>
+              <w:t xml:space="preserve">4</w:t>
+            </w:r>
+          </w:p>
+        </w:tc>
+      </w:tr>
+      <w:tr>
+        <w:tc>
+          <w:tcPr/>
+          <w:p>
+            <w:pPr>
+              <w:pStyle w:val="Compact"/>
+              <w:jc w:val="left"/>
+            </w:pPr>
+            <w:r>
+              <w:t xml:space="preserve">Almas Tussipov</w:t>
+            </w:r>
+          </w:p>
+        </w:tc>
+        <w:tc>
+          <w:tcPr/>
+          <w:p>
+            <w:pPr>
+              <w:pStyle w:val="Compact"/>
+              <w:jc w:val="left"/>
+            </w:pPr>
+            <w:r>
+              <w:t xml:space="preserve">4</w:t>
+            </w:r>
+          </w:p>
+        </w:tc>
+        <w:tc>
+          <w:tcPr/>
+          <w:p>
+            <w:pPr>
+              <w:pStyle w:val="Compact"/>
+              <w:jc w:val="left"/>
+            </w:pPr>
+            <w:r>
+              <w:t xml:space="preserve">4</w:t>
+            </w:r>
+          </w:p>
+        </w:tc>
+        <w:tc>
+          <w:tcPr/>
+          <w:p>
+            <w:pPr>
+              <w:pStyle w:val="Compact"/>
+              <w:jc w:val="left"/>
+            </w:pPr>
+            <w:r>
+              <w:t xml:space="preserve">4</w:t>
+            </w:r>
+          </w:p>
+        </w:tc>
+        <w:tc>
+          <w:tcPr/>
+          <w:p>
+            <w:pPr>
+              <w:pStyle w:val="Compact"/>
+              <w:jc w:val="left"/>
+            </w:pPr>
+            <w:r>
+              <w:t xml:space="preserve">5</w:t>
+            </w:r>
+          </w:p>
+        </w:tc>
+        <w:tc>
+          <w:tcPr/>
+          <w:p>
+            <w:pPr>
+              <w:pStyle w:val="Compact"/>
+              <w:jc w:val="left"/>
+            </w:pPr>
+            <w:r>
+              <w:t xml:space="preserve">5</w:t>
+            </w:r>
+          </w:p>
+        </w:tc>
+        <w:tc>
+          <w:tcPr/>
+          <w:p>
+            <w:pPr>
+              <w:pStyle w:val="Compact"/>
+              <w:jc w:val="left"/>
+            </w:pPr>
+            <w:r>
+              <w:t xml:space="preserve">5</w:t>
+            </w:r>
+          </w:p>
+        </w:tc>
+        <w:tc>
+          <w:tcPr/>
+          <w:p>
+            <w:pPr>
+              <w:pStyle w:val="Compact"/>
+              <w:jc w:val="left"/>
+            </w:pPr>
+            <w:r>
+              <w:t xml:space="preserve">3</w:t>
+            </w:r>
+          </w:p>
+        </w:tc>
+        <w:tc>
+          <w:tcPr/>
+          <w:p>
+            <w:pPr>
+              <w:pStyle w:val="Compact"/>
+              <w:jc w:val="left"/>
+            </w:pPr>
+            <w:r>
+              <w:t xml:space="preserve">4</w:t>
+            </w:r>
+          </w:p>
+        </w:tc>
+        <w:tc>
+          <w:tcPr/>
+          <w:p>
+            <w:pPr>
+              <w:pStyle w:val="Compact"/>
+              <w:jc w:val="left"/>
+            </w:pPr>
+            <w:r>
+              <w:t xml:space="preserve">2</w:t>
+            </w:r>
+          </w:p>
+        </w:tc>
+      </w:tr>
+    </w:tbl>
     <w:bookmarkEnd w:id="64"/>
-    <w:bookmarkStart w:id="66" w:name="team-skill-visualization"/>
+    <w:bookmarkStart w:id="69" w:name="team-skill-visualization"/>
     <w:p>
       <w:pPr>
         <w:pStyle w:val="Heading2"/>
@@ -39592,7 +40432,54 @@
         <w:t xml:space="preserve">plt.show()</w:t>
       </w:r>
     </w:p>
-    <w:bookmarkStart w:id="65" w:name="interpretation"/>
+    <w:p>
+      <w:pPr>
+        <w:pStyle w:val="FirstParagraph"/>
+      </w:pPr>
+      <w:r>
+        <w:drawing>
+          <wp:inline>
+            <wp:extent cx="5334000" cy="3435655"/>
+            <wp:effectExtent b="0" l="0" r="0" t="0"/>
+            <wp:docPr descr="" title="" id="66" name="Picture"/>
+            <a:graphic>
+              <a:graphicData uri="http://schemas.openxmlformats.org/drawingml/2006/picture">
+                <pic:pic>
+                  <pic:nvPicPr>
+                    <pic:cNvPr descr="final_report_files/figure-docx/cell-49-output-1.png" id="67" name="Picture"/>
+                    <pic:cNvPicPr>
+                      <a:picLocks noChangeArrowheads="1" noChangeAspect="1"/>
+                    </pic:cNvPicPr>
+                  </pic:nvPicPr>
+                  <pic:blipFill>
+                    <a:blip r:embed="rId65"/>
+                    <a:stretch>
+                      <a:fillRect/>
+                    </a:stretch>
+                  </pic:blipFill>
+                  <pic:spPr bwMode="auto">
+                    <a:xfrm>
+                      <a:off x="0" y="0"/>
+                      <a:ext cx="5334000" cy="3435655"/>
+                    </a:xfrm>
+                    <a:prstGeom prst="rect">
+                      <a:avLst/>
+                    </a:prstGeom>
+                    <a:noFill/>
+                    <a:ln w="9525">
+                      <a:noFill/>
+                      <a:headEnd/>
+                      <a:tailEnd/>
+                    </a:ln>
+                  </pic:spPr>
+                </pic:pic>
+              </a:graphicData>
+            </a:graphic>
+          </wp:inline>
+        </w:drawing>
+      </w:r>
+    </w:p>
+    <w:bookmarkStart w:id="68" w:name="interpretation"/>
     <w:p>
       <w:pPr>
         <w:pStyle w:val="Heading3"/>
@@ -39617,9 +40504,9 @@
         <w:t xml:space="preserve">This suggests that the team is well-prepared for basic data analysis tasks but may face challenges when applying advanced analytics techniques in real-world business environments.</w:t>
       </w:r>
     </w:p>
-    <w:bookmarkEnd w:id="65"/>
-    <w:bookmarkEnd w:id="66"/>
-    <w:bookmarkStart w:id="67" w:name="comparing-team-skills-with-market-demand"/>
+    <w:bookmarkEnd w:id="68"/>
+    <w:bookmarkEnd w:id="69"/>
+    <w:bookmarkStart w:id="70" w:name="comparing-team-skills-with-market-demand"/>
     <w:p>
       <w:pPr>
         <w:pStyle w:val="Heading2"/>
@@ -40277,8 +41164,521 @@
         <w:t xml:space="preserve">gap_df</w:t>
       </w:r>
     </w:p>
-    <w:bookmarkEnd w:id="67"/>
-    <w:bookmarkStart w:id="69" w:name="skill-gap-visualization"/>
+    <w:tbl>
+      <w:tblPr>
+        <w:tblStyle w:val="Table"/>
+        <w:tblW w:type="auto" w:w="0"/>
+        <w:tblLook w:firstRow="1" w:lastRow="0" w:firstColumn="0" w:lastColumn="0" w:noHBand="0" w:noVBand="0" w:val="0020"/>
+        <w:jc w:val="start"/>
+      </w:tblPr>
+      <w:tblGrid>
+        <w:gridCol w:w="1980"/>
+        <w:gridCol w:w="1980"/>
+        <w:gridCol w:w="1980"/>
+        <w:gridCol w:w="1980"/>
+      </w:tblGrid>
+      <w:tr>
+        <w:trPr>
+          <w:tblHeader w:val="true"/>
+        </w:trPr>
+        <w:tc>
+          <w:tcPr/>
+          <w:p>
+            <w:pPr>
+              <w:pStyle w:val="Compact"/>
+            </w:pPr>
+          </w:p>
+        </w:tc>
+        <w:tc>
+          <w:tcPr/>
+          <w:p>
+            <w:pPr>
+              <w:pStyle w:val="Compact"/>
+              <w:jc w:val="left"/>
+            </w:pPr>
+            <w:r>
+              <w:t xml:space="preserve">Team Average</w:t>
+            </w:r>
+          </w:p>
+        </w:tc>
+        <w:tc>
+          <w:tcPr/>
+          <w:p>
+            <w:pPr>
+              <w:pStyle w:val="Compact"/>
+              <w:jc w:val="left"/>
+            </w:pPr>
+            <w:r>
+              <w:t xml:space="preserve">Market Demand</w:t>
+            </w:r>
+          </w:p>
+        </w:tc>
+        <w:tc>
+          <w:tcPr/>
+          <w:p>
+            <w:pPr>
+              <w:pStyle w:val="Compact"/>
+              <w:jc w:val="left"/>
+            </w:pPr>
+            <w:r>
+              <w:t xml:space="preserve">Gap</w:t>
+            </w:r>
+          </w:p>
+        </w:tc>
+      </w:tr>
+      <w:tr>
+        <w:tc>
+          <w:tcPr/>
+          <w:p>
+            <w:pPr>
+              <w:pStyle w:val="Compact"/>
+              <w:jc w:val="left"/>
+            </w:pPr>
+            <w:r>
+              <w:t xml:space="preserve">Python</w:t>
+            </w:r>
+          </w:p>
+        </w:tc>
+        <w:tc>
+          <w:tcPr/>
+          <w:p>
+            <w:pPr>
+              <w:pStyle w:val="Compact"/>
+              <w:jc w:val="left"/>
+            </w:pPr>
+            <w:r>
+              <w:t xml:space="preserve">3.6</w:t>
+            </w:r>
+          </w:p>
+        </w:tc>
+        <w:tc>
+          <w:tcPr/>
+          <w:p>
+            <w:pPr>
+              <w:pStyle w:val="Compact"/>
+              <w:jc w:val="left"/>
+            </w:pPr>
+            <w:r>
+              <w:t xml:space="preserve">5</w:t>
+            </w:r>
+          </w:p>
+        </w:tc>
+        <w:tc>
+          <w:tcPr/>
+          <w:p>
+            <w:pPr>
+              <w:pStyle w:val="Compact"/>
+              <w:jc w:val="left"/>
+            </w:pPr>
+            <w:r>
+              <w:t xml:space="preserve">1.4</w:t>
+            </w:r>
+          </w:p>
+        </w:tc>
+      </w:tr>
+      <w:tr>
+        <w:tc>
+          <w:tcPr/>
+          <w:p>
+            <w:pPr>
+              <w:pStyle w:val="Compact"/>
+              <w:jc w:val="left"/>
+            </w:pPr>
+            <w:r>
+              <w:t xml:space="preserve">SQL</w:t>
+            </w:r>
+          </w:p>
+        </w:tc>
+        <w:tc>
+          <w:tcPr/>
+          <w:p>
+            <w:pPr>
+              <w:pStyle w:val="Compact"/>
+              <w:jc w:val="left"/>
+            </w:pPr>
+            <w:r>
+              <w:t xml:space="preserve">3.6</w:t>
+            </w:r>
+          </w:p>
+        </w:tc>
+        <w:tc>
+          <w:tcPr/>
+          <w:p>
+            <w:pPr>
+              <w:pStyle w:val="Compact"/>
+              <w:jc w:val="left"/>
+            </w:pPr>
+            <w:r>
+              <w:t xml:space="preserve">5</w:t>
+            </w:r>
+          </w:p>
+        </w:tc>
+        <w:tc>
+          <w:tcPr/>
+          <w:p>
+            <w:pPr>
+              <w:pStyle w:val="Compact"/>
+              <w:jc w:val="left"/>
+            </w:pPr>
+            <w:r>
+              <w:t xml:space="preserve">1.4</w:t>
+            </w:r>
+          </w:p>
+        </w:tc>
+      </w:tr>
+      <w:tr>
+        <w:tc>
+          <w:tcPr/>
+          <w:p>
+            <w:pPr>
+              <w:pStyle w:val="Compact"/>
+              <w:jc w:val="left"/>
+            </w:pPr>
+            <w:r>
+              <w:t xml:space="preserve">AWS/Azure</w:t>
+            </w:r>
+          </w:p>
+        </w:tc>
+        <w:tc>
+          <w:tcPr/>
+          <w:p>
+            <w:pPr>
+              <w:pStyle w:val="Compact"/>
+              <w:jc w:val="left"/>
+            </w:pPr>
+            <w:r>
+              <w:t xml:space="preserve">3.0</w:t>
+            </w:r>
+          </w:p>
+        </w:tc>
+        <w:tc>
+          <w:tcPr/>
+          <w:p>
+            <w:pPr>
+              <w:pStyle w:val="Compact"/>
+              <w:jc w:val="left"/>
+            </w:pPr>
+            <w:r>
+              <w:t xml:space="preserve">4</w:t>
+            </w:r>
+          </w:p>
+        </w:tc>
+        <w:tc>
+          <w:tcPr/>
+          <w:p>
+            <w:pPr>
+              <w:pStyle w:val="Compact"/>
+              <w:jc w:val="left"/>
+            </w:pPr>
+            <w:r>
+              <w:t xml:space="preserve">1.0</w:t>
+            </w:r>
+          </w:p>
+        </w:tc>
+      </w:tr>
+      <w:tr>
+        <w:tc>
+          <w:tcPr/>
+          <w:p>
+            <w:pPr>
+              <w:pStyle w:val="Compact"/>
+              <w:jc w:val="left"/>
+            </w:pPr>
+            <w:r>
+              <w:t xml:space="preserve">Machine Learning</w:t>
+            </w:r>
+          </w:p>
+        </w:tc>
+        <w:tc>
+          <w:tcPr/>
+          <w:p>
+            <w:pPr>
+              <w:pStyle w:val="Compact"/>
+              <w:jc w:val="left"/>
+            </w:pPr>
+            <w:r>
+              <w:t xml:space="preserve">3.4</w:t>
+            </w:r>
+          </w:p>
+        </w:tc>
+        <w:tc>
+          <w:tcPr/>
+          <w:p>
+            <w:pPr>
+              <w:pStyle w:val="Compact"/>
+              <w:jc w:val="left"/>
+            </w:pPr>
+            <w:r>
+              <w:t xml:space="preserve">4</w:t>
+            </w:r>
+          </w:p>
+        </w:tc>
+        <w:tc>
+          <w:tcPr/>
+          <w:p>
+            <w:pPr>
+              <w:pStyle w:val="Compact"/>
+              <w:jc w:val="left"/>
+            </w:pPr>
+            <w:r>
+              <w:t xml:space="preserve">0.6</w:t>
+            </w:r>
+          </w:p>
+        </w:tc>
+      </w:tr>
+      <w:tr>
+        <w:tc>
+          <w:tcPr/>
+          <w:p>
+            <w:pPr>
+              <w:pStyle w:val="Compact"/>
+              <w:jc w:val="left"/>
+            </w:pPr>
+            <w:r>
+              <w:t xml:space="preserve">Statistics</w:t>
+            </w:r>
+          </w:p>
+        </w:tc>
+        <w:tc>
+          <w:tcPr/>
+          <w:p>
+            <w:pPr>
+              <w:pStyle w:val="Compact"/>
+              <w:jc w:val="left"/>
+            </w:pPr>
+            <w:r>
+              <w:t xml:space="preserve">4.0</w:t>
+            </w:r>
+          </w:p>
+        </w:tc>
+        <w:tc>
+          <w:tcPr/>
+          <w:p>
+            <w:pPr>
+              <w:pStyle w:val="Compact"/>
+              <w:jc w:val="left"/>
+            </w:pPr>
+            <w:r>
+              <w:t xml:space="preserve">4</w:t>
+            </w:r>
+          </w:p>
+        </w:tc>
+        <w:tc>
+          <w:tcPr/>
+          <w:p>
+            <w:pPr>
+              <w:pStyle w:val="Compact"/>
+              <w:jc w:val="left"/>
+            </w:pPr>
+            <w:r>
+              <w:t xml:space="preserve">0.0</w:t>
+            </w:r>
+          </w:p>
+        </w:tc>
+      </w:tr>
+      <w:tr>
+        <w:tc>
+          <w:tcPr/>
+          <w:p>
+            <w:pPr>
+              <w:pStyle w:val="Compact"/>
+              <w:jc w:val="left"/>
+            </w:pPr>
+            <w:r>
+              <w:t xml:space="preserve">Tableau/Power BI</w:t>
+            </w:r>
+          </w:p>
+        </w:tc>
+        <w:tc>
+          <w:tcPr/>
+          <w:p>
+            <w:pPr>
+              <w:pStyle w:val="Compact"/>
+              <w:jc w:val="left"/>
+            </w:pPr>
+            <w:r>
+              <w:t xml:space="preserve">4.2</w:t>
+            </w:r>
+          </w:p>
+        </w:tc>
+        <w:tc>
+          <w:tcPr/>
+          <w:p>
+            <w:pPr>
+              <w:pStyle w:val="Compact"/>
+              <w:jc w:val="left"/>
+            </w:pPr>
+            <w:r>
+              <w:t xml:space="preserve">4</w:t>
+            </w:r>
+          </w:p>
+        </w:tc>
+        <w:tc>
+          <w:tcPr/>
+          <w:p>
+            <w:pPr>
+              <w:pStyle w:val="Compact"/>
+              <w:jc w:val="left"/>
+            </w:pPr>
+            <w:r>
+              <w:t xml:space="preserve">-0.2</w:t>
+            </w:r>
+          </w:p>
+        </w:tc>
+      </w:tr>
+      <w:tr>
+        <w:tc>
+          <w:tcPr/>
+          <w:p>
+            <w:pPr>
+              <w:pStyle w:val="Compact"/>
+              <w:jc w:val="left"/>
+            </w:pPr>
+            <w:r>
+              <w:t xml:space="preserve">Data Visualization</w:t>
+            </w:r>
+          </w:p>
+        </w:tc>
+        <w:tc>
+          <w:tcPr/>
+          <w:p>
+            <w:pPr>
+              <w:pStyle w:val="Compact"/>
+              <w:jc w:val="left"/>
+            </w:pPr>
+            <w:r>
+              <w:t xml:space="preserve">4.6</w:t>
+            </w:r>
+          </w:p>
+        </w:tc>
+        <w:tc>
+          <w:tcPr/>
+          <w:p>
+            <w:pPr>
+              <w:pStyle w:val="Compact"/>
+              <w:jc w:val="left"/>
+            </w:pPr>
+            <w:r>
+              <w:t xml:space="preserve">4</w:t>
+            </w:r>
+          </w:p>
+        </w:tc>
+        <w:tc>
+          <w:tcPr/>
+          <w:p>
+            <w:pPr>
+              <w:pStyle w:val="Compact"/>
+              <w:jc w:val="left"/>
+            </w:pPr>
+            <w:r>
+              <w:t xml:space="preserve">-0.6</w:t>
+            </w:r>
+          </w:p>
+        </w:tc>
+      </w:tr>
+      <w:tr>
+        <w:tc>
+          <w:tcPr/>
+          <w:p>
+            <w:pPr>
+              <w:pStyle w:val="Compact"/>
+              <w:jc w:val="left"/>
+            </w:pPr>
+            <w:r>
+              <w:t xml:space="preserve">AI/ML Tools</w:t>
+            </w:r>
+          </w:p>
+        </w:tc>
+        <w:tc>
+          <w:tcPr/>
+          <w:p>
+            <w:pPr>
+              <w:pStyle w:val="Compact"/>
+              <w:jc w:val="left"/>
+            </w:pPr>
+            <w:r>
+              <w:t xml:space="preserve">3.6</w:t>
+            </w:r>
+          </w:p>
+        </w:tc>
+        <w:tc>
+          <w:tcPr/>
+          <w:p>
+            <w:pPr>
+              <w:pStyle w:val="Compact"/>
+              <w:jc w:val="left"/>
+            </w:pPr>
+            <w:r>
+              <w:t xml:space="preserve">3</w:t>
+            </w:r>
+          </w:p>
+        </w:tc>
+        <w:tc>
+          <w:tcPr/>
+          <w:p>
+            <w:pPr>
+              <w:pStyle w:val="Compact"/>
+              <w:jc w:val="left"/>
+            </w:pPr>
+            <w:r>
+              <w:t xml:space="preserve">-0.6</w:t>
+            </w:r>
+          </w:p>
+        </w:tc>
+      </w:tr>
+      <w:tr>
+        <w:tc>
+          <w:tcPr/>
+          <w:p>
+            <w:pPr>
+              <w:pStyle w:val="Compact"/>
+              <w:jc w:val="left"/>
+            </w:pPr>
+            <w:r>
+              <w:t xml:space="preserve">Excel</w:t>
+            </w:r>
+          </w:p>
+        </w:tc>
+        <w:tc>
+          <w:tcPr/>
+          <w:p>
+            <w:pPr>
+              <w:pStyle w:val="Compact"/>
+              <w:jc w:val="left"/>
+            </w:pPr>
+            <w:r>
+              <w:t xml:space="preserve">4.4</w:t>
+            </w:r>
+          </w:p>
+        </w:tc>
+        <w:tc>
+          <w:tcPr/>
+          <w:p>
+            <w:pPr>
+              <w:pStyle w:val="Compact"/>
+              <w:jc w:val="left"/>
+            </w:pPr>
+            <w:r>
+              <w:t xml:space="preserve">3</w:t>
+            </w:r>
+          </w:p>
+        </w:tc>
+        <w:tc>
+          <w:tcPr/>
+          <w:p>
+            <w:pPr>
+              <w:pStyle w:val="Compact"/>
+              <w:jc w:val="left"/>
+            </w:pPr>
+            <w:r>
+              <w:t xml:space="preserve">-1.4</w:t>
+            </w:r>
+          </w:p>
+        </w:tc>
+      </w:tr>
+    </w:tbl>
+    <w:bookmarkEnd w:id="70"/>
+    <w:bookmarkStart w:id="75" w:name="skill-gap-visualization"/>
     <w:p>
       <w:pPr>
         <w:pStyle w:val="Heading2"/>
@@ -40460,7 +41860,54 @@
         <w:t xml:space="preserve">plt.show()</w:t>
       </w:r>
     </w:p>
-    <w:bookmarkStart w:id="68" w:name="interpretation-1"/>
+    <w:p>
+      <w:pPr>
+        <w:pStyle w:val="FirstParagraph"/>
+      </w:pPr>
+      <w:r>
+        <w:drawing>
+          <wp:inline>
+            <wp:extent cx="5334000" cy="3182062"/>
+            <wp:effectExtent b="0" l="0" r="0" t="0"/>
+            <wp:docPr descr="" title="" id="72" name="Picture"/>
+            <a:graphic>
+              <a:graphicData uri="http://schemas.openxmlformats.org/drawingml/2006/picture">
+                <pic:pic>
+                  <pic:nvPicPr>
+                    <pic:cNvPr descr="final_report_files/figure-docx/cell-51-output-1.png" id="73" name="Picture"/>
+                    <pic:cNvPicPr>
+                      <a:picLocks noChangeArrowheads="1" noChangeAspect="1"/>
+                    </pic:cNvPicPr>
+                  </pic:nvPicPr>
+                  <pic:blipFill>
+                    <a:blip r:embed="rId71"/>
+                    <a:stretch>
+                      <a:fillRect/>
+                    </a:stretch>
+                  </pic:blipFill>
+                  <pic:spPr bwMode="auto">
+                    <a:xfrm>
+                      <a:off x="0" y="0"/>
+                      <a:ext cx="5334000" cy="3182062"/>
+                    </a:xfrm>
+                    <a:prstGeom prst="rect">
+                      <a:avLst/>
+                    </a:prstGeom>
+                    <a:noFill/>
+                    <a:ln w="9525">
+                      <a:noFill/>
+                      <a:headEnd/>
+                      <a:tailEnd/>
+                    </a:ln>
+                  </pic:spPr>
+                </pic:pic>
+              </a:graphicData>
+            </a:graphic>
+          </wp:inline>
+        </w:drawing>
+      </w:r>
+    </w:p>
+    <w:bookmarkStart w:id="74" w:name="interpretation-1"/>
     <w:p>
       <w:pPr>
         <w:pStyle w:val="Heading3"/>
@@ -40485,9 +41932,9 @@
         <w:t xml:space="preserve">This indicates that while the team has a solid analytical foundation, there is a need to strengthen more advanced technical capabilities to remain competitive in the job market.</w:t>
       </w:r>
     </w:p>
-    <w:bookmarkEnd w:id="68"/>
-    <w:bookmarkEnd w:id="69"/>
-    <w:bookmarkStart w:id="70" w:name="recommendations-for-skill-development"/>
+    <w:bookmarkEnd w:id="74"/>
+    <w:bookmarkEnd w:id="75"/>
+    <w:bookmarkStart w:id="76" w:name="recommendations-for-skill-development"/>
     <w:p>
       <w:pPr>
         <w:pStyle w:val="Heading2"/>
@@ -40564,8 +42011,8 @@
         <w:t xml:space="preserve">Work on real-world projects to integrate analysis, modelling, and visualization</w:t>
       </w:r>
     </w:p>
-    <w:bookmarkEnd w:id="70"/>
-    <w:bookmarkStart w:id="71" w:name="conclusion-1"/>
+    <w:bookmarkEnd w:id="76"/>
+    <w:bookmarkStart w:id="77" w:name="conclusion-1"/>
     <w:p>
       <w:pPr>
         <w:pStyle w:val="Heading2"/>
@@ -40597,9 +42044,9 @@
         </w:pict>
       </w:r>
     </w:p>
-    <w:bookmarkEnd w:id="71"/>
-    <w:bookmarkEnd w:id="72"/>
-    <w:bookmarkStart w:id="76" w:name="career-strategy-nlp-analysis"/>
+    <w:bookmarkEnd w:id="77"/>
+    <w:bookmarkEnd w:id="78"/>
+    <w:bookmarkStart w:id="82" w:name="career-strategy-nlp-analysis"/>
     <w:p>
       <w:pPr>
         <w:pStyle w:val="Heading1"/>
@@ -40616,7 +42063,7 @@
         <w:t xml:space="preserve">This section extends the EDA with an independent career strategy analysis, covering AI tier classification, career planning insights, and Natural Language Processing (NLP) applied to job title text.</w:t>
       </w:r>
     </w:p>
-    <w:bookmarkStart w:id="73" w:name="data-setup"/>
+    <w:bookmarkStart w:id="79" w:name="data-setup"/>
     <w:p>
       <w:pPr>
         <w:pStyle w:val="Heading2"/>
@@ -43056,8 +44503,8 @@
         <w:t xml:space="preserve">)</w:t>
       </w:r>
     </w:p>
-    <w:bookmarkEnd w:id="73"/>
-    <w:bookmarkStart w:id="74" w:name="X43b84eb2b16c62aa45fe78e7cce3a112b4ab375"/>
+    <w:bookmarkEnd w:id="79"/>
+    <w:bookmarkStart w:id="80" w:name="X43b84eb2b16c62aa45fe78e7cce3a112b4ab375"/>
     <w:p>
       <w:pPr>
         <w:pStyle w:val="Heading2"/>
@@ -49623,8 +51070,8 @@
         <w:t xml:space="preserve">    fig.show()</w:t>
       </w:r>
     </w:p>
-    <w:bookmarkEnd w:id="74"/>
-    <w:bookmarkStart w:id="75" w:name="Xebe8a31c0ad8fefc7409ec9921308cd610581be"/>
+    <w:bookmarkEnd w:id="80"/>
+    <w:bookmarkStart w:id="81" w:name="Xebe8a31c0ad8fefc7409ec9921308cd610581be"/>
     <w:p>
       <w:pPr>
         <w:pStyle w:val="Heading2"/>
@@ -51412,9 +52859,9 @@
         </w:pict>
       </w:r>
     </w:p>
-    <w:bookmarkEnd w:id="75"/>
-    <w:bookmarkEnd w:id="76"/>
-    <w:bookmarkStart w:id="80" w:name="references"/>
+    <w:bookmarkEnd w:id="81"/>
+    <w:bookmarkEnd w:id="82"/>
+    <w:bookmarkStart w:id="86" w:name="references"/>
     <w:p>
       <w:pPr>
         <w:pStyle w:val="Heading1"/>
@@ -51423,8 +52870,8 @@
         <w:t xml:space="preserve">7. References</w:t>
       </w:r>
     </w:p>
-    <w:bookmarkStart w:id="79" w:name="refs"/>
-    <w:bookmarkStart w:id="78" w:name="ref-lightcast2024"/>
+    <w:bookmarkStart w:id="85" w:name="refs"/>
+    <w:bookmarkStart w:id="84" w:name="ref-lightcast2024"/>
     <w:p>
       <w:pPr>
         <w:pStyle w:val="Bibliography"/>
@@ -51447,7 +52894,7 @@
       <w:r>
         <w:t xml:space="preserve"> </w:t>
       </w:r>
-      <w:hyperlink r:id="rId77">
+      <w:hyperlink r:id="rId83">
         <w:r>
           <w:rPr>
             <w:rStyle w:val="Hyperlink"/>
@@ -51459,9 +52906,9 @@
         <w:t xml:space="preserve">.</w:t>
       </w:r>
     </w:p>
-    <w:bookmarkEnd w:id="78"/>
-    <w:bookmarkEnd w:id="79"/>
-    <w:bookmarkEnd w:id="80"/>
+    <w:bookmarkEnd w:id="84"/>
+    <w:bookmarkEnd w:id="85"/>
+    <w:bookmarkEnd w:id="86"/>
     <w:sectPr/>
   </w:body>
 </w:document>

</xml_diff>